<commit_message>
fix: Coach from real .docx; Givenchy/Guerlain now fixed-term
- Coach: re-tokenised from LC's real .docx (received as proper Word),
  restoring the letterhead/logo; drops the textutil stopgap conversion.
- Givenchy & Guerlain were open-ended in LC's files. Made both fixed-term
  by inserting LC's standard "Contract Duration" clause (verbatim) before
  "Schedule Of Benefits"; added the contract end-date field to both configs.
  Removed the now-unused START_ONLY date set — all 5 brands are start+end.

tsc + eslint clean; 96 tests pass; build OK.

Co-Authored-By: Claude Opus 4.8 (1M context) <noreply@anthropic.com>
</commit_message>
<xml_diff>
--- a/public/templates/my-cs-givenchy.docx
+++ b/public/templates/my-cs-givenchy.docx
@@ -1135,6 +1135,46 @@
           <w:szCs w:val="22"/>
         </w:rPr>
       </w:pPr>
+    </w:p>
+    <w:p>
+      <w:pPr>
+        <w:pStyle w:val="Heading1"/>
+        <w:numPr>
+          <w:ilvl w:val="0"/>
+          <w:numId w:val="3"/>
+        </w:numPr>
+        <w:jc w:val="both"/>
+        <w:rPr>
+          <w:rFonts w:ascii="Segoe UI" w:hAnsi="Segoe UI" w:cs="Segoe UI"/>
+          <w:szCs w:val="22"/>
+        </w:rPr>
+      </w:pPr>
+      <w:r>
+        <w:rPr>
+          <w:rFonts w:ascii="Segoe UI" w:hAnsi="Segoe UI" w:cs="Segoe UI"/>
+          <w:szCs w:val="22"/>
+        </w:rPr>
+        <w:t xml:space="preserve">Contract Duration</w:t>
+      </w:r>
+    </w:p>
+    <w:p>
+      <w:pPr>
+        <w:ind w:left="720"/>
+        <w:jc w:val="both"/>
+        <w:rPr>
+          <w:rFonts w:ascii="Segoe UI" w:hAnsi="Segoe UI" w:cs="Segoe UI"/>
+          <w:sz w:val="22"/>
+          <w:szCs w:val="22"/>
+        </w:rPr>
+      </w:pPr>
+      <w:r>
+        <w:rPr>
+          <w:rFonts w:ascii="Segoe UI" w:hAnsi="Segoe UI" w:cs="Segoe UI"/>
+          <w:sz w:val="22"/>
+          <w:szCs w:val="22"/>
+        </w:rPr>
+        <w:t xml:space="preserve">The agreed employment duration is from {startDate} to {endDate}. It may be subject to renewal based on mutual agreement between you and Luxury Careers.</w:t>
+      </w:r>
     </w:p>
     <w:p>
       <w:pPr>

</xml_diff>